<commit_message>
feat(ageless): Dr Kpaduwa's subject, as Dr Akinware revised it
"Maintaining Beauty Aesthetics and Skin for Men and Women as they age",
and beauty supplements rather than supplements in her speaker focus. Those
are the only two changes on her second pass; every other subject, bio and
question set is unchanged.

Her document still shows her chairing, because she marked up her own earlier
copy. Debo confirmed he is replacing her on the panel, so the chair stays
with him and she stays the host.

Co-Authored-By: Claude Opus 5 (1M context) <noreply@anthropic.com>
</commit_message>
<xml_diff>
--- a/docs/ageless/AGELESS - Speaker Content for Review.docx
+++ b/docs/ageless/AGELESS - Speaker Content for Review.docx
@@ -1296,7 +1296,7 @@
     </w:p>
     <w:p>
       <w:r>
-        <w:t>Aesthetics and Skin Ageing for Men and Women</w:t>
+        <w:t>Maintaining Beauty Aesthetics and Skin for Men and Women as they age</w:t>
       </w:r>
     </w:p>
     <w:p>
@@ -1309,7 +1309,7 @@
     </w:p>
     <w:p>
       <w:r>
-        <w:t>Dr Chinwe should give guests a grounded medical view of aesthetics for men and women. She should explain how the face, skin, fat pads, fascia and facial structure change with age; what happens to skin quality, lines, sagging, pigmentation and hair; how women may experience body changes after pregnancy such as diastasis recti or loose skin; and how to think responsibly about skincare, supplements, nutrition, Botox, fillers, regenerative treatments, lasers and surgery. Black skin safety, scarring, pigmentation and natural-looking outcomes should remain central.</w:t>
+        <w:t>Dr Chinwe should give guests a grounded medical view of aesthetics for men and women. She should explain how the face, skin, fat pads, fascia and facial structure change with age; what happens to skin quality, lines, sagging, pigmentation and hair; how women may experience body changes after pregnancy such as diastasis recti or loose skin; and how to think responsibly about skincare, beauty supplements, nutrition, Botox, fillers, regenerative treatments, lasers and surgery. Black skin safety, scarring, pigmentation and natural-looking outcomes should remain central.</w:t>
       </w:r>
     </w:p>
     <w:p>

</xml_diff>

<commit_message>
feat(ageless): Dr Kpaduwa's subject, as Dr Akinware revised it (#41)
"Maintaining Beauty Aesthetics and Skin for Men and Women as they age", and
beauty supplements rather than supplements in her speaker focus. Those are
the only two changes on her second pass; every other subject, bio and
question set is unchanged.

Her document still shows her chairing, because she marked up her own earlier
copy. Debo confirmed he is replacing her on the panel, so the chair stays
with him and she stays the host.

Co-authored-by: Claude Opus 5 (1M context) <noreply@anthropic.com>
</commit_message>
<xml_diff>
--- a/docs/ageless/AGELESS - Speaker Content for Review.docx
+++ b/docs/ageless/AGELESS - Speaker Content for Review.docx
@@ -1296,7 +1296,7 @@
     </w:p>
     <w:p>
       <w:r>
-        <w:t>Aesthetics and Skin Ageing for Men and Women</w:t>
+        <w:t>Maintaining Beauty Aesthetics and Skin for Men and Women as they age</w:t>
       </w:r>
     </w:p>
     <w:p>
@@ -1309,7 +1309,7 @@
     </w:p>
     <w:p>
       <w:r>
-        <w:t>Dr Chinwe should give guests a grounded medical view of aesthetics for men and women. She should explain how the face, skin, fat pads, fascia and facial structure change with age; what happens to skin quality, lines, sagging, pigmentation and hair; how women may experience body changes after pregnancy such as diastasis recti or loose skin; and how to think responsibly about skincare, supplements, nutrition, Botox, fillers, regenerative treatments, lasers and surgery. Black skin safety, scarring, pigmentation and natural-looking outcomes should remain central.</w:t>
+        <w:t>Dr Chinwe should give guests a grounded medical view of aesthetics for men and women. She should explain how the face, skin, fat pads, fascia and facial structure change with age; what happens to skin quality, lines, sagging, pigmentation and hair; how women may experience body changes after pregnancy such as diastasis recti or loose skin; and how to think responsibly about skincare, beauty supplements, nutrition, Botox, fillers, regenerative treatments, lasers and surgery. Black skin safety, scarring, pigmentation and natural-looking outcomes should remain central.</w:t>
       </w:r>
     </w:p>
     <w:p>

</xml_diff>